<commit_message>
Live Monitor Color Change To Gold
</commit_message>
<xml_diff>
--- a/N+_Development_Chronology.docx
+++ b/N+_Development_Chronology.docx
@@ -1636,13 +1636,7 @@
         </w:pBdr>
       </w:pPr>
       <w:r>
-        <w:t>May 2</w:t>
-      </w:r>
-      <w:r>
-        <w:t>9</w:t>
-      </w:r>
-      <w:r>
-        <w:t>, 2026</w:t>
+        <w:t>May 29, 2026</w:t>
       </w:r>
     </w:p>
     <w:p>
@@ -1716,12 +1710,153 @@
     </w:p>
     <w:p>
       <w:pPr>
-        <w:spacing w:before="180" w:after="180"/>
+        <w:spacing w:after="180"/>
         <w:rPr>
           <w:rFonts w:asciiTheme="minorHAnsi" w:eastAsia="Times New Roman" w:hAnsiTheme="minorHAnsi" w:cstheme="minorHAnsi"/>
           <w:color w:val="000000"/>
         </w:rPr>
       </w:pPr>
+    </w:p>
+    <w:p>
+      <w:pPr>
+        <w:spacing w:after="180"/>
+        <w:rPr>
+          <w:rFonts w:asciiTheme="minorHAnsi" w:eastAsia="Times New Roman" w:hAnsiTheme="minorHAnsi" w:cstheme="minorHAnsi"/>
+          <w:color w:val="000000"/>
+        </w:rPr>
+      </w:pPr>
+    </w:p>
+    <w:p>
+      <w:pPr>
+        <w:pStyle w:val="Heading2"/>
+        <w:pBdr>
+          <w:bottom w:val="single" w:sz="6" w:space="4" w:color="BFBFBF"/>
+        </w:pBdr>
+      </w:pPr>
+      <w:r>
+        <w:lastRenderedPageBreak/>
+        <w:t>June</w:t>
+      </w:r>
+      <w:r>
+        <w:t xml:space="preserve"> </w:t>
+      </w:r>
+      <w:r>
+        <w:t>02</w:t>
+      </w:r>
+      <w:r>
+        <w:t>, 2026</w:t>
+      </w:r>
+    </w:p>
+    <w:p>
+      <w:pPr>
+        <w:shd w:val="clear" w:color="auto" w:fill="FFFFFF"/>
+        <w:textAlignment w:val="baseline"/>
+        <w:rPr>
+          <w:rFonts w:ascii="Aptos" w:eastAsia="Times New Roman" w:hAnsi="Aptos" w:cs="Times New Roman"/>
+          <w:color w:val="000000"/>
+        </w:rPr>
+      </w:pPr>
+      <w:r>
+        <w:rPr>
+          <w:rFonts w:ascii="Aptos" w:eastAsia="Times New Roman" w:hAnsi="Aptos" w:cs="Times New Roman"/>
+          <w:color w:val="000000"/>
+        </w:rPr>
+        <w:t>Very Minor Update:</w:t>
+      </w:r>
+    </w:p>
+    <w:p>
+      <w:pPr>
+        <w:numPr>
+          <w:ilvl w:val="0"/>
+          <w:numId w:val="6"/>
+        </w:numPr>
+        <w:shd w:val="clear" w:color="auto" w:fill="FFFFFF"/>
+        <w:spacing w:after="180"/>
+        <w:textAlignment w:val="baseline"/>
+        <w:rPr>
+          <w:rFonts w:ascii="Aptos" w:eastAsia="Times New Roman" w:hAnsi="Aptos" w:cs="Segoe UI"/>
+          <w:color w:val="000000"/>
+        </w:rPr>
+      </w:pPr>
+      <w:r>
+        <w:rPr>
+          <w:rFonts w:ascii="Aptos" w:eastAsia="Times New Roman" w:hAnsi="Aptos" w:cs="Segoe UI"/>
+          <w:color w:val="000000"/>
+        </w:rPr>
+        <w:t>Changed purple tab option to red. </w:t>
+      </w:r>
+    </w:p>
+    <w:p>
+      <w:pPr>
+        <w:spacing w:before="180" w:after="180"/>
+        <w:rPr>
+          <w:rFonts w:asciiTheme="minorHAnsi" w:eastAsia="Times New Roman" w:hAnsiTheme="minorHAnsi" w:cstheme="minorHAnsi"/>
+          <w:color w:val="000000"/>
+        </w:rPr>
+      </w:pPr>
+    </w:p>
+    <w:p>
+      <w:pPr>
+        <w:pStyle w:val="Heading2"/>
+        <w:pBdr>
+          <w:bottom w:val="single" w:sz="6" w:space="4" w:color="BFBFBF"/>
+        </w:pBdr>
+      </w:pPr>
+      <w:r>
+        <w:t>June</w:t>
+      </w:r>
+      <w:r>
+        <w:t xml:space="preserve"> </w:t>
+      </w:r>
+      <w:r>
+        <w:t>03</w:t>
+      </w:r>
+      <w:r>
+        <w:t>, 2026</w:t>
+      </w:r>
+    </w:p>
+    <w:p>
+      <w:pPr>
+        <w:rPr>
+          <w:rFonts w:ascii="Aptos" w:eastAsia="Times New Roman" w:hAnsi="Aptos" w:cs="Times New Roman"/>
+          <w:color w:val="000000"/>
+        </w:rPr>
+      </w:pPr>
+    </w:p>
+    <w:p>
+      <w:pPr>
+        <w:rPr>
+          <w:rFonts w:ascii="Aptos" w:eastAsia="Times New Roman" w:hAnsi="Aptos" w:cs="Times New Roman"/>
+          <w:color w:val="000000"/>
+        </w:rPr>
+      </w:pPr>
+      <w:r>
+        <w:rPr>
+          <w:rFonts w:ascii="Aptos" w:eastAsia="Times New Roman" w:hAnsi="Aptos" w:cs="Times New Roman"/>
+          <w:color w:val="000000"/>
+        </w:rPr>
+        <w:t>Very Minor Update:</w:t>
+      </w:r>
+    </w:p>
+    <w:p>
+      <w:pPr>
+        <w:numPr>
+          <w:ilvl w:val="0"/>
+          <w:numId w:val="5"/>
+        </w:numPr>
+        <w:spacing w:after="180"/>
+        <w:rPr>
+          <w:rFonts w:ascii="Aptos" w:eastAsia="Times New Roman" w:hAnsi="Aptos" w:cs="Times New Roman"/>
+          <w:color w:val="000000"/>
+        </w:rPr>
+      </w:pPr>
+      <w:r>
+        <w:rPr>
+          <w:rFonts w:ascii="Aptos" w:eastAsia="Times New Roman" w:hAnsi="Aptos" w:cs="Times New Roman"/>
+          <w:color w:val="000000"/>
+        </w:rPr>
+        <w:t>Changed Live Monitor Tab Color from Green to Gold </w:t>
+      </w:r>
     </w:p>
     <w:p>
       <w:pPr>
@@ -1909,6 +2044,155 @@
 <file path=word/numbering.xml><?xml version="1.0" encoding="utf-8"?>
 <w:numbering xmlns:wpc="http://schemas.microsoft.com/office/word/2010/wordprocessingCanvas" xmlns:cx="http://schemas.microsoft.com/office/drawing/2014/chartex" xmlns:cx1="http://schemas.microsoft.com/office/drawing/2015/9/8/chartex" xmlns:cx2="http://schemas.microsoft.com/office/drawing/2015/10/21/chartex" xmlns:cx3="http://schemas.microsoft.com/office/drawing/2016/5/9/chartex" xmlns:cx4="http://schemas.microsoft.com/office/drawing/2016/5/10/chartex" xmlns:cx5="http://schemas.microsoft.com/office/drawing/2016/5/11/chartex" xmlns:cx6="http://schemas.microsoft.com/office/drawing/2016/5/12/chartex" xmlns:cx7="http://schemas.microsoft.com/office/drawing/2016/5/13/chartex" xmlns:cx8="http://schemas.microsoft.com/office/drawing/2016/5/14/chartex" xmlns:mc="http://schemas.openxmlformats.org/markup-compatibility/2006" xmlns:aink="http://schemas.microsoft.com/office/drawing/2016/ink" xmlns:am3d="http://schemas.microsoft.com/office/drawing/2017/model3d" xmlns:o="urn:schemas-microsoft-com:office:office" xmlns:oel="http://schemas.microsoft.com/office/2019/extlst" xmlns:r="http://schemas.openxmlformats.org/officeDocument/2006/relationships" xmlns:m="http://schemas.openxmlformats.org/officeDocument/2006/math" xmlns:v="urn:schemas-microsoft-com:vml" xmlns:wp14="http://schemas.microsoft.com/office/word/2010/wordprocessingDrawing" xmlns:wp="http://schemas.openxmlformats.org/drawingml/2006/wordprocessingDrawing" xmlns:w10="urn:schemas-microsoft-com:office:word" xmlns:w="http://schemas.openxmlformats.org/wordprocessingml/2006/main" xmlns:w14="http://schemas.microsoft.com/office/word/2010/wordml" xmlns:w15="http://schemas.microsoft.com/office/word/2012/wordml" xmlns:w16cex="http://schemas.microsoft.com/office/word/2018/wordml/cex" xmlns:w16cid="http://schemas.microsoft.com/office/word/2016/wordml/cid" xmlns:w16="http://schemas.microsoft.com/office/word/2018/wordml" xmlns:w16sdtdh="http://schemas.microsoft.com/office/word/2020/wordml/sdtdatahash" xmlns:w16se="http://schemas.microsoft.com/office/word/2015/wordml/symex" xmlns:wpg="http://schemas.microsoft.com/office/word/2010/wordprocessingGroup" xmlns:wpi="http://schemas.microsoft.com/office/word/2010/wordprocessingInk" xmlns:wne="http://schemas.microsoft.com/office/word/2006/wordml" xmlns:wps="http://schemas.microsoft.com/office/word/2010/wordprocessingShape" mc:Ignorable="w14 w15 w16se w16cid w16 w16cex w16sdtdh wp14">
   <w:abstractNum w:abstractNumId="0" w15:restartNumberingAfterBreak="0">
+    <w:nsid w:val="06CB4FE1"/>
+    <w:multiLevelType w:val="multilevel"/>
+    <w:tmpl w:val="5156AA40"/>
+    <w:lvl w:ilvl="0">
+      <w:start w:val="1"/>
+      <w:numFmt w:val="bullet"/>
+      <w:lvlText w:val=""/>
+      <w:lvlJc w:val="left"/>
+      <w:pPr>
+        <w:tabs>
+          <w:tab w:val="num" w:pos="720"/>
+        </w:tabs>
+        <w:ind w:left="720" w:hanging="360"/>
+      </w:pPr>
+      <w:rPr>
+        <w:rFonts w:ascii="Symbol" w:hAnsi="Symbol" w:hint="default"/>
+        <w:sz w:val="20"/>
+      </w:rPr>
+    </w:lvl>
+    <w:lvl w:ilvl="1" w:tentative="1">
+      <w:start w:val="1"/>
+      <w:numFmt w:val="bullet"/>
+      <w:lvlText w:val=""/>
+      <w:lvlJc w:val="left"/>
+      <w:pPr>
+        <w:tabs>
+          <w:tab w:val="num" w:pos="1440"/>
+        </w:tabs>
+        <w:ind w:left="1440" w:hanging="360"/>
+      </w:pPr>
+      <w:rPr>
+        <w:rFonts w:ascii="Symbol" w:hAnsi="Symbol" w:hint="default"/>
+        <w:sz w:val="20"/>
+      </w:rPr>
+    </w:lvl>
+    <w:lvl w:ilvl="2" w:tentative="1">
+      <w:start w:val="1"/>
+      <w:numFmt w:val="bullet"/>
+      <w:lvlText w:val=""/>
+      <w:lvlJc w:val="left"/>
+      <w:pPr>
+        <w:tabs>
+          <w:tab w:val="num" w:pos="2160"/>
+        </w:tabs>
+        <w:ind w:left="2160" w:hanging="360"/>
+      </w:pPr>
+      <w:rPr>
+        <w:rFonts w:ascii="Symbol" w:hAnsi="Symbol" w:hint="default"/>
+        <w:sz w:val="20"/>
+      </w:rPr>
+    </w:lvl>
+    <w:lvl w:ilvl="3" w:tentative="1">
+      <w:start w:val="1"/>
+      <w:numFmt w:val="bullet"/>
+      <w:lvlText w:val=""/>
+      <w:lvlJc w:val="left"/>
+      <w:pPr>
+        <w:tabs>
+          <w:tab w:val="num" w:pos="2880"/>
+        </w:tabs>
+        <w:ind w:left="2880" w:hanging="360"/>
+      </w:pPr>
+      <w:rPr>
+        <w:rFonts w:ascii="Symbol" w:hAnsi="Symbol" w:hint="default"/>
+        <w:sz w:val="20"/>
+      </w:rPr>
+    </w:lvl>
+    <w:lvl w:ilvl="4" w:tentative="1">
+      <w:start w:val="1"/>
+      <w:numFmt w:val="bullet"/>
+      <w:lvlText w:val=""/>
+      <w:lvlJc w:val="left"/>
+      <w:pPr>
+        <w:tabs>
+          <w:tab w:val="num" w:pos="3600"/>
+        </w:tabs>
+        <w:ind w:left="3600" w:hanging="360"/>
+      </w:pPr>
+      <w:rPr>
+        <w:rFonts w:ascii="Symbol" w:hAnsi="Symbol" w:hint="default"/>
+        <w:sz w:val="20"/>
+      </w:rPr>
+    </w:lvl>
+    <w:lvl w:ilvl="5" w:tentative="1">
+      <w:start w:val="1"/>
+      <w:numFmt w:val="bullet"/>
+      <w:lvlText w:val=""/>
+      <w:lvlJc w:val="left"/>
+      <w:pPr>
+        <w:tabs>
+          <w:tab w:val="num" w:pos="4320"/>
+        </w:tabs>
+        <w:ind w:left="4320" w:hanging="360"/>
+      </w:pPr>
+      <w:rPr>
+        <w:rFonts w:ascii="Symbol" w:hAnsi="Symbol" w:hint="default"/>
+        <w:sz w:val="20"/>
+      </w:rPr>
+    </w:lvl>
+    <w:lvl w:ilvl="6" w:tentative="1">
+      <w:start w:val="1"/>
+      <w:numFmt w:val="bullet"/>
+      <w:lvlText w:val=""/>
+      <w:lvlJc w:val="left"/>
+      <w:pPr>
+        <w:tabs>
+          <w:tab w:val="num" w:pos="5040"/>
+        </w:tabs>
+        <w:ind w:left="5040" w:hanging="360"/>
+      </w:pPr>
+      <w:rPr>
+        <w:rFonts w:ascii="Symbol" w:hAnsi="Symbol" w:hint="default"/>
+        <w:sz w:val="20"/>
+      </w:rPr>
+    </w:lvl>
+    <w:lvl w:ilvl="7" w:tentative="1">
+      <w:start w:val="1"/>
+      <w:numFmt w:val="bullet"/>
+      <w:lvlText w:val=""/>
+      <w:lvlJc w:val="left"/>
+      <w:pPr>
+        <w:tabs>
+          <w:tab w:val="num" w:pos="5760"/>
+        </w:tabs>
+        <w:ind w:left="5760" w:hanging="360"/>
+      </w:pPr>
+      <w:rPr>
+        <w:rFonts w:ascii="Symbol" w:hAnsi="Symbol" w:hint="default"/>
+        <w:sz w:val="20"/>
+      </w:rPr>
+    </w:lvl>
+    <w:lvl w:ilvl="8" w:tentative="1">
+      <w:start w:val="1"/>
+      <w:numFmt w:val="bullet"/>
+      <w:lvlText w:val=""/>
+      <w:lvlJc w:val="left"/>
+      <w:pPr>
+        <w:tabs>
+          <w:tab w:val="num" w:pos="6480"/>
+        </w:tabs>
+        <w:ind w:left="6480" w:hanging="360"/>
+      </w:pPr>
+      <w:rPr>
+        <w:rFonts w:ascii="Symbol" w:hAnsi="Symbol" w:hint="default"/>
+        <w:sz w:val="20"/>
+      </w:rPr>
+    </w:lvl>
+  </w:abstractNum>
+  <w:abstractNum w:abstractNumId="1" w15:restartNumberingAfterBreak="0">
     <w:nsid w:val="10541052"/>
     <w:multiLevelType w:val="multilevel"/>
     <w:tmpl w:val="73C26044"/>
@@ -2057,7 +2341,156 @@
       </w:rPr>
     </w:lvl>
   </w:abstractNum>
-  <w:abstractNum w:abstractNumId="1" w15:restartNumberingAfterBreak="0">
+  <w:abstractNum w:abstractNumId="2" w15:restartNumberingAfterBreak="0">
+    <w:nsid w:val="1FE53F0A"/>
+    <w:multiLevelType w:val="multilevel"/>
+    <w:tmpl w:val="65FCDD9C"/>
+    <w:lvl w:ilvl="0">
+      <w:start w:val="1"/>
+      <w:numFmt w:val="bullet"/>
+      <w:lvlText w:val=""/>
+      <w:lvlJc w:val="left"/>
+      <w:pPr>
+        <w:tabs>
+          <w:tab w:val="num" w:pos="720"/>
+        </w:tabs>
+        <w:ind w:left="720" w:hanging="360"/>
+      </w:pPr>
+      <w:rPr>
+        <w:rFonts w:ascii="Symbol" w:hAnsi="Symbol" w:hint="default"/>
+        <w:sz w:val="20"/>
+      </w:rPr>
+    </w:lvl>
+    <w:lvl w:ilvl="1" w:tentative="1">
+      <w:start w:val="1"/>
+      <w:numFmt w:val="bullet"/>
+      <w:lvlText w:val=""/>
+      <w:lvlJc w:val="left"/>
+      <w:pPr>
+        <w:tabs>
+          <w:tab w:val="num" w:pos="1440"/>
+        </w:tabs>
+        <w:ind w:left="1440" w:hanging="360"/>
+      </w:pPr>
+      <w:rPr>
+        <w:rFonts w:ascii="Symbol" w:hAnsi="Symbol" w:hint="default"/>
+        <w:sz w:val="20"/>
+      </w:rPr>
+    </w:lvl>
+    <w:lvl w:ilvl="2" w:tentative="1">
+      <w:start w:val="1"/>
+      <w:numFmt w:val="bullet"/>
+      <w:lvlText w:val=""/>
+      <w:lvlJc w:val="left"/>
+      <w:pPr>
+        <w:tabs>
+          <w:tab w:val="num" w:pos="2160"/>
+        </w:tabs>
+        <w:ind w:left="2160" w:hanging="360"/>
+      </w:pPr>
+      <w:rPr>
+        <w:rFonts w:ascii="Symbol" w:hAnsi="Symbol" w:hint="default"/>
+        <w:sz w:val="20"/>
+      </w:rPr>
+    </w:lvl>
+    <w:lvl w:ilvl="3" w:tentative="1">
+      <w:start w:val="1"/>
+      <w:numFmt w:val="bullet"/>
+      <w:lvlText w:val=""/>
+      <w:lvlJc w:val="left"/>
+      <w:pPr>
+        <w:tabs>
+          <w:tab w:val="num" w:pos="2880"/>
+        </w:tabs>
+        <w:ind w:left="2880" w:hanging="360"/>
+      </w:pPr>
+      <w:rPr>
+        <w:rFonts w:ascii="Symbol" w:hAnsi="Symbol" w:hint="default"/>
+        <w:sz w:val="20"/>
+      </w:rPr>
+    </w:lvl>
+    <w:lvl w:ilvl="4" w:tentative="1">
+      <w:start w:val="1"/>
+      <w:numFmt w:val="bullet"/>
+      <w:lvlText w:val=""/>
+      <w:lvlJc w:val="left"/>
+      <w:pPr>
+        <w:tabs>
+          <w:tab w:val="num" w:pos="3600"/>
+        </w:tabs>
+        <w:ind w:left="3600" w:hanging="360"/>
+      </w:pPr>
+      <w:rPr>
+        <w:rFonts w:ascii="Symbol" w:hAnsi="Symbol" w:hint="default"/>
+        <w:sz w:val="20"/>
+      </w:rPr>
+    </w:lvl>
+    <w:lvl w:ilvl="5" w:tentative="1">
+      <w:start w:val="1"/>
+      <w:numFmt w:val="bullet"/>
+      <w:lvlText w:val=""/>
+      <w:lvlJc w:val="left"/>
+      <w:pPr>
+        <w:tabs>
+          <w:tab w:val="num" w:pos="4320"/>
+        </w:tabs>
+        <w:ind w:left="4320" w:hanging="360"/>
+      </w:pPr>
+      <w:rPr>
+        <w:rFonts w:ascii="Symbol" w:hAnsi="Symbol" w:hint="default"/>
+        <w:sz w:val="20"/>
+      </w:rPr>
+    </w:lvl>
+    <w:lvl w:ilvl="6" w:tentative="1">
+      <w:start w:val="1"/>
+      <w:numFmt w:val="bullet"/>
+      <w:lvlText w:val=""/>
+      <w:lvlJc w:val="left"/>
+      <w:pPr>
+        <w:tabs>
+          <w:tab w:val="num" w:pos="5040"/>
+        </w:tabs>
+        <w:ind w:left="5040" w:hanging="360"/>
+      </w:pPr>
+      <w:rPr>
+        <w:rFonts w:ascii="Symbol" w:hAnsi="Symbol" w:hint="default"/>
+        <w:sz w:val="20"/>
+      </w:rPr>
+    </w:lvl>
+    <w:lvl w:ilvl="7" w:tentative="1">
+      <w:start w:val="1"/>
+      <w:numFmt w:val="bullet"/>
+      <w:lvlText w:val=""/>
+      <w:lvlJc w:val="left"/>
+      <w:pPr>
+        <w:tabs>
+          <w:tab w:val="num" w:pos="5760"/>
+        </w:tabs>
+        <w:ind w:left="5760" w:hanging="360"/>
+      </w:pPr>
+      <w:rPr>
+        <w:rFonts w:ascii="Symbol" w:hAnsi="Symbol" w:hint="default"/>
+        <w:sz w:val="20"/>
+      </w:rPr>
+    </w:lvl>
+    <w:lvl w:ilvl="8" w:tentative="1">
+      <w:start w:val="1"/>
+      <w:numFmt w:val="bullet"/>
+      <w:lvlText w:val=""/>
+      <w:lvlJc w:val="left"/>
+      <w:pPr>
+        <w:tabs>
+          <w:tab w:val="num" w:pos="6480"/>
+        </w:tabs>
+        <w:ind w:left="6480" w:hanging="360"/>
+      </w:pPr>
+      <w:rPr>
+        <w:rFonts w:ascii="Symbol" w:hAnsi="Symbol" w:hint="default"/>
+        <w:sz w:val="20"/>
+      </w:rPr>
+    </w:lvl>
+  </w:abstractNum>
+  <w:abstractNum w:abstractNumId="3" w15:restartNumberingAfterBreak="0">
     <w:nsid w:val="458006F9"/>
     <w:multiLevelType w:val="multilevel"/>
     <w:tmpl w:val="737E369C"/>
@@ -2206,7 +2639,7 @@
       </w:rPr>
     </w:lvl>
   </w:abstractNum>
-  <w:abstractNum w:abstractNumId="2" w15:restartNumberingAfterBreak="0">
+  <w:abstractNum w:abstractNumId="4" w15:restartNumberingAfterBreak="0">
     <w:nsid w:val="5AEC5DB4"/>
     <w:multiLevelType w:val="hybridMultilevel"/>
     <w:tmpl w:val="35D0BF50"/>
@@ -2292,7 +2725,7 @@
       </w:pPr>
     </w:lvl>
   </w:abstractNum>
-  <w:abstractNum w:abstractNumId="3" w15:restartNumberingAfterBreak="0">
+  <w:abstractNum w:abstractNumId="5" w15:restartNumberingAfterBreak="0">
     <w:nsid w:val="77925BEA"/>
     <w:multiLevelType w:val="hybridMultilevel"/>
     <w:tmpl w:val="CFC2EFAC"/>
@@ -2347,22 +2780,28 @@
     </w:lvl>
   </w:abstractNum>
   <w:num w:numId="1" w16cid:durableId="1802846629">
-    <w:abstractNumId w:val="2"/>
+    <w:abstractNumId w:val="4"/>
     <w:lvlOverride w:ilvl="0">
       <w:startOverride w:val="1"/>
     </w:lvlOverride>
   </w:num>
   <w:num w:numId="2" w16cid:durableId="1815637663">
-    <w:abstractNumId w:val="3"/>
+    <w:abstractNumId w:val="5"/>
     <w:lvlOverride w:ilvl="0">
       <w:startOverride w:val="1"/>
     </w:lvlOverride>
   </w:num>
   <w:num w:numId="3" w16cid:durableId="1483815556">
+    <w:abstractNumId w:val="1"/>
+  </w:num>
+  <w:num w:numId="4" w16cid:durableId="1532066881">
+    <w:abstractNumId w:val="3"/>
+  </w:num>
+  <w:num w:numId="5" w16cid:durableId="1685159897">
     <w:abstractNumId w:val="0"/>
   </w:num>
-  <w:num w:numId="4" w16cid:durableId="1532066881">
-    <w:abstractNumId w:val="1"/>
+  <w:num w:numId="6" w16cid:durableId="1476753302">
+    <w:abstractNumId w:val="2"/>
   </w:num>
 </w:numbering>
 </file>

</xml_diff>

<commit_message>
multi-line tabs,find all in open documents, bug fixes
</commit_message>
<xml_diff>
--- a/N+_Development_Chronology.docx
+++ b/N+_Development_Chronology.docx
@@ -212,8 +212,13 @@
         <w:spacing w:after="60"/>
       </w:pPr>
       <w:r>
-        <w:t>Show all characters</w:t>
-      </w:r>
+        <w:t xml:space="preserve">Show all </w:t>
+      </w:r>
+      <w:proofErr w:type="gramStart"/>
+      <w:r>
+        <w:t>characters</w:t>
+      </w:r>
+      <w:proofErr w:type="gramEnd"/>
     </w:p>
     <w:p>
       <w:pPr>
@@ -317,7 +322,15 @@
         <w:spacing w:after="60"/>
       </w:pPr>
       <w:r>
-        <w:t>Hot Exit — restores open tabs and toggle states (light/dark theme, word wrap, show all characters, indent guide lines)</w:t>
+        <w:t xml:space="preserve">Hot Exit — restores open tabs and toggle states (light/dark theme, word wrap, show all characters, indent </w:t>
+      </w:r>
+      <w:proofErr w:type="gramStart"/>
+      <w:r>
+        <w:t>guide lines</w:t>
+      </w:r>
+      <w:proofErr w:type="gramEnd"/>
+      <w:r>
+        <w:t>)</w:t>
       </w:r>
     </w:p>
     <w:p>
@@ -352,8 +365,13 @@
         <w:spacing w:after="60"/>
       </w:pPr>
       <w:r>
-        <w:t>Added word wrap option</w:t>
-      </w:r>
+        <w:t xml:space="preserve">Added word wrap </w:t>
+      </w:r>
+      <w:proofErr w:type="gramStart"/>
+      <w:r>
+        <w:t>option</w:t>
+      </w:r>
+      <w:proofErr w:type="gramEnd"/>
     </w:p>
     <w:p>
       <w:pPr>
@@ -378,8 +396,13 @@
         <w:spacing w:after="60"/>
       </w:pPr>
       <w:r>
-        <w:t>Updated in-app user guide</w:t>
-      </w:r>
+        <w:t xml:space="preserve">Updated in-app user </w:t>
+      </w:r>
+      <w:proofErr w:type="gramStart"/>
+      <w:r>
+        <w:t>guide</w:t>
+      </w:r>
+      <w:proofErr w:type="gramEnd"/>
     </w:p>
     <w:p>
       <w:pPr>
@@ -415,8 +438,13 @@
         <w:spacing w:after="60"/>
       </w:pPr>
       <w:r>
-        <w:t>Added “File › Save As” to the File menu</w:t>
-      </w:r>
+        <w:t xml:space="preserve">Added “File › Save As” to the File </w:t>
+      </w:r>
+      <w:proofErr w:type="gramStart"/>
+      <w:r>
+        <w:t>menu</w:t>
+      </w:r>
+      <w:proofErr w:type="gramEnd"/>
     </w:p>
     <w:p>
       <w:pPr>
@@ -441,8 +469,13 @@
         <w:spacing w:after="60"/>
       </w:pPr>
       <w:r>
-        <w:t>Column Selection can now be performed with mouse + ALT key</w:t>
-      </w:r>
+        <w:t xml:space="preserve">Column Selection can now be performed with mouse + ALT </w:t>
+      </w:r>
+      <w:proofErr w:type="gramStart"/>
+      <w:r>
+        <w:t>key</w:t>
+      </w:r>
+      <w:proofErr w:type="gramEnd"/>
     </w:p>
     <w:p>
       <w:pPr>
@@ -478,21 +511,31 @@
         <w:spacing w:after="60"/>
       </w:pPr>
       <w:r>
-        <w:t>Added a status bar</w:t>
-      </w:r>
-    </w:p>
-    <w:p>
-      <w:pPr>
-        <w:pStyle w:val="ListParagraph"/>
-        <w:numPr>
-          <w:ilvl w:val="0"/>
-          <w:numId w:val="2"/>
-        </w:numPr>
-        <w:spacing w:after="60"/>
-      </w:pPr>
-      <w:r>
-        <w:t>Read-only file tabs now appear in light red for easier identification</w:t>
-      </w:r>
+        <w:t xml:space="preserve">Added a status </w:t>
+      </w:r>
+      <w:proofErr w:type="gramStart"/>
+      <w:r>
+        <w:t>bar</w:t>
+      </w:r>
+      <w:proofErr w:type="gramEnd"/>
+    </w:p>
+    <w:p>
+      <w:pPr>
+        <w:pStyle w:val="ListParagraph"/>
+        <w:numPr>
+          <w:ilvl w:val="0"/>
+          <w:numId w:val="2"/>
+        </w:numPr>
+        <w:spacing w:after="60"/>
+      </w:pPr>
+      <w:r>
+        <w:t xml:space="preserve">Read-only file tabs now appear in light red for easier </w:t>
+      </w:r>
+      <w:proofErr w:type="gramStart"/>
+      <w:r>
+        <w:t>identification</w:t>
+      </w:r>
+      <w:proofErr w:type="gramEnd"/>
     </w:p>
     <w:p>
       <w:pPr>
@@ -599,8 +642,13 @@
         <w:spacing w:after="60"/>
       </w:pPr>
       <w:r>
-        <w:t>Persistent macro load/save system</w:t>
-      </w:r>
+        <w:t xml:space="preserve">Persistent macro load/save </w:t>
+      </w:r>
+      <w:proofErr w:type="gramStart"/>
+      <w:r>
+        <w:t>system</w:t>
+      </w:r>
+      <w:proofErr w:type="gramEnd"/>
     </w:p>
     <w:p>
       <w:pPr>
@@ -625,21 +673,31 @@
         <w:spacing w:after="60"/>
       </w:pPr>
       <w:r>
-        <w:t>Macro Play icon added to toolbar</w:t>
-      </w:r>
-    </w:p>
-    <w:p>
-      <w:pPr>
-        <w:pStyle w:val="ListParagraph"/>
-        <w:numPr>
-          <w:ilvl w:val="0"/>
-          <w:numId w:val="2"/>
-        </w:numPr>
-        <w:spacing w:after="60"/>
-      </w:pPr>
-      <w:r>
-        <w:t>New File icon added</w:t>
-      </w:r>
+        <w:t xml:space="preserve">Macro Play icon added to </w:t>
+      </w:r>
+      <w:proofErr w:type="gramStart"/>
+      <w:r>
+        <w:t>toolbar</w:t>
+      </w:r>
+      <w:proofErr w:type="gramEnd"/>
+    </w:p>
+    <w:p>
+      <w:pPr>
+        <w:pStyle w:val="ListParagraph"/>
+        <w:numPr>
+          <w:ilvl w:val="0"/>
+          <w:numId w:val="2"/>
+        </w:numPr>
+        <w:spacing w:after="60"/>
+      </w:pPr>
+      <w:r>
+        <w:t xml:space="preserve">New File icon </w:t>
+      </w:r>
+      <w:proofErr w:type="gramStart"/>
+      <w:r>
+        <w:t>added</w:t>
+      </w:r>
+      <w:proofErr w:type="gramEnd"/>
     </w:p>
     <w:p>
       <w:pPr>
@@ -664,7 +722,15 @@
         <w:spacing w:after="60"/>
       </w:pPr>
       <w:r>
-        <w:t>JSON tree viewer relocated to a left-side panel</w:t>
+        <w:t xml:space="preserve">JSON tree viewer relocated to a </w:t>
+      </w:r>
+      <w:proofErr w:type="gramStart"/>
+      <w:r>
+        <w:t>left-side</w:t>
+      </w:r>
+      <w:proofErr w:type="gramEnd"/>
+      <w:r>
+        <w:t xml:space="preserve"> panel</w:t>
       </w:r>
     </w:p>
     <w:p>
@@ -741,60 +807,85 @@
       </w:pPr>
       <w:r>
         <w:lastRenderedPageBreak/>
-        <w:t>Application toolbar icons and menu fonts now support zoom (F11 to zoom in, F12 to zoom out); status bar displays the current zoom level</w:t>
-      </w:r>
-    </w:p>
-    <w:p>
-      <w:pPr>
-        <w:pStyle w:val="ListParagraph"/>
-        <w:numPr>
-          <w:ilvl w:val="0"/>
-          <w:numId w:val="2"/>
-        </w:numPr>
-        <w:spacing w:after="60"/>
-      </w:pPr>
-      <w:r>
-        <w:t>Ctrl + mouse wheel zooms the active editor tab content</w:t>
-      </w:r>
-    </w:p>
-    <w:p>
-      <w:pPr>
-        <w:pStyle w:val="ListParagraph"/>
-        <w:numPr>
-          <w:ilvl w:val="0"/>
-          <w:numId w:val="2"/>
-        </w:numPr>
-        <w:spacing w:after="60"/>
-      </w:pPr>
-      <w:r>
-        <w:t>Selected text auto-fills the Find field</w:t>
-      </w:r>
-    </w:p>
-    <w:p>
-      <w:pPr>
-        <w:pStyle w:val="ListParagraph"/>
-        <w:numPr>
-          <w:ilvl w:val="0"/>
-          <w:numId w:val="2"/>
-        </w:numPr>
-        <w:spacing w:after="60"/>
-      </w:pPr>
-      <w:r>
-        <w:t>Find/Replace now maintains a recent history</w:t>
-      </w:r>
-    </w:p>
-    <w:p>
-      <w:pPr>
-        <w:pStyle w:val="ListParagraph"/>
-        <w:numPr>
-          <w:ilvl w:val="0"/>
-          <w:numId w:val="2"/>
-        </w:numPr>
-        <w:spacing w:after="60"/>
-      </w:pPr>
-      <w:r>
-        <w:t>If a file is changed or removed externally, user is prompted to reload or remove it from the editor</w:t>
-      </w:r>
+        <w:t xml:space="preserve">Application toolbar icons and menu fonts now support zoom (F11 to zoom in, F12 to zoom out); status bar displays the current zoom </w:t>
+      </w:r>
+      <w:proofErr w:type="gramStart"/>
+      <w:r>
+        <w:t>level</w:t>
+      </w:r>
+      <w:proofErr w:type="gramEnd"/>
+    </w:p>
+    <w:p>
+      <w:pPr>
+        <w:pStyle w:val="ListParagraph"/>
+        <w:numPr>
+          <w:ilvl w:val="0"/>
+          <w:numId w:val="2"/>
+        </w:numPr>
+        <w:spacing w:after="60"/>
+      </w:pPr>
+      <w:r>
+        <w:t xml:space="preserve">Ctrl + mouse wheel zooms the active editor tab </w:t>
+      </w:r>
+      <w:proofErr w:type="gramStart"/>
+      <w:r>
+        <w:t>content</w:t>
+      </w:r>
+      <w:proofErr w:type="gramEnd"/>
+    </w:p>
+    <w:p>
+      <w:pPr>
+        <w:pStyle w:val="ListParagraph"/>
+        <w:numPr>
+          <w:ilvl w:val="0"/>
+          <w:numId w:val="2"/>
+        </w:numPr>
+        <w:spacing w:after="60"/>
+      </w:pPr>
+      <w:r>
+        <w:t xml:space="preserve">Selected text auto-fills the Find </w:t>
+      </w:r>
+      <w:proofErr w:type="gramStart"/>
+      <w:r>
+        <w:t>field</w:t>
+      </w:r>
+      <w:proofErr w:type="gramEnd"/>
+    </w:p>
+    <w:p>
+      <w:pPr>
+        <w:pStyle w:val="ListParagraph"/>
+        <w:numPr>
+          <w:ilvl w:val="0"/>
+          <w:numId w:val="2"/>
+        </w:numPr>
+        <w:spacing w:after="60"/>
+      </w:pPr>
+      <w:r>
+        <w:t xml:space="preserve">Find/Replace now maintains a recent </w:t>
+      </w:r>
+      <w:proofErr w:type="gramStart"/>
+      <w:r>
+        <w:t>history</w:t>
+      </w:r>
+      <w:proofErr w:type="gramEnd"/>
+    </w:p>
+    <w:p>
+      <w:pPr>
+        <w:pStyle w:val="ListParagraph"/>
+        <w:numPr>
+          <w:ilvl w:val="0"/>
+          <w:numId w:val="2"/>
+        </w:numPr>
+        <w:spacing w:after="60"/>
+      </w:pPr>
+      <w:r>
+        <w:t xml:space="preserve">If a file is changed or removed externally, user is prompted to reload or remove it from the </w:t>
+      </w:r>
+      <w:proofErr w:type="gramStart"/>
+      <w:r>
+        <w:t>editor</w:t>
+      </w:r>
+      <w:proofErr w:type="gramEnd"/>
     </w:p>
     <w:p>
       <w:pPr>
@@ -856,7 +947,15 @@
         <w:spacing w:after="60"/>
       </w:pPr>
       <w:r>
-        <w:t>Fixed issues with opening files already in use and live-monitoring them</w:t>
+        <w:t xml:space="preserve">Fixed issues with opening files already in use and </w:t>
+      </w:r>
+      <w:proofErr w:type="gramStart"/>
+      <w:r>
+        <w:t>live-monitoring</w:t>
+      </w:r>
+      <w:proofErr w:type="gramEnd"/>
+      <w:r>
+        <w:t xml:space="preserve"> them</w:t>
       </w:r>
     </w:p>
     <w:p>
@@ -892,6 +991,7 @@
         <w:t>php</w:t>
       </w:r>
       <w:proofErr w:type="spellEnd"/>
+      <w:proofErr w:type="gramStart"/>
       <w:r>
         <w:t>, .</w:t>
       </w:r>
@@ -900,6 +1000,7 @@
         <w:t>yml</w:t>
       </w:r>
       <w:proofErr w:type="spellEnd"/>
+      <w:proofErr w:type="gramEnd"/>
       <w:r>
         <w:t>, and .</w:t>
       </w:r>
@@ -922,21 +1023,31 @@
         <w:spacing w:after="60"/>
       </w:pPr>
       <w:r>
-        <w:t>Added support for ANSI, UTF-8 with BOM, UTF-16 BE with BOM, and UTF-16 LE with BOM encodings</w:t>
-      </w:r>
-    </w:p>
-    <w:p>
-      <w:pPr>
-        <w:pStyle w:val="ListParagraph"/>
-        <w:numPr>
-          <w:ilvl w:val="0"/>
-          <w:numId w:val="2"/>
-        </w:numPr>
-        <w:spacing w:after="60"/>
-      </w:pPr>
-      <w:r>
-        <w:t>Updated the Find/Replace/Mark dialog to display results in the status bar rather than a pop-up</w:t>
-      </w:r>
+        <w:t xml:space="preserve">Added support for ANSI, UTF-8 with BOM, UTF-16 BE with BOM, and UTF-16 LE with BOM </w:t>
+      </w:r>
+      <w:proofErr w:type="gramStart"/>
+      <w:r>
+        <w:t>encodings</w:t>
+      </w:r>
+      <w:proofErr w:type="gramEnd"/>
+    </w:p>
+    <w:p>
+      <w:pPr>
+        <w:pStyle w:val="ListParagraph"/>
+        <w:numPr>
+          <w:ilvl w:val="0"/>
+          <w:numId w:val="2"/>
+        </w:numPr>
+        <w:spacing w:after="60"/>
+      </w:pPr>
+      <w:r>
+        <w:t xml:space="preserve">Updated the Find/Replace/Mark dialog to display results in the status bar rather than a </w:t>
+      </w:r>
+      <w:proofErr w:type="gramStart"/>
+      <w:r>
+        <w:t>pop-up</w:t>
+      </w:r>
+      <w:proofErr w:type="gramEnd"/>
     </w:p>
     <w:p>
       <w:pPr>
@@ -972,8 +1083,13 @@
         <w:spacing w:after="60"/>
       </w:pPr>
       <w:r>
-        <w:t>Resolved several bugs in the macro subsystem</w:t>
-      </w:r>
+        <w:t xml:space="preserve">Resolved several bugs in the macro </w:t>
+      </w:r>
+      <w:proofErr w:type="gramStart"/>
+      <w:r>
+        <w:t>subsystem</w:t>
+      </w:r>
+      <w:proofErr w:type="gramEnd"/>
     </w:p>
     <w:p>
       <w:pPr>
@@ -1022,21 +1138,31 @@
         <w:spacing w:after="60"/>
       </w:pPr>
       <w:r>
-        <w:t>Added Find in Files feature to the Find/Replace dialog</w:t>
-      </w:r>
-    </w:p>
-    <w:p>
-      <w:pPr>
-        <w:pStyle w:val="ListParagraph"/>
-        <w:numPr>
-          <w:ilvl w:val="0"/>
-          <w:numId w:val="2"/>
-        </w:numPr>
-        <w:spacing w:after="60"/>
-      </w:pPr>
-      <w:r>
-        <w:t>Added Find in Files icon to the toolbar</w:t>
-      </w:r>
+        <w:t xml:space="preserve">Added Find in Files feature to the Find/Replace </w:t>
+      </w:r>
+      <w:proofErr w:type="gramStart"/>
+      <w:r>
+        <w:t>dialog</w:t>
+      </w:r>
+      <w:proofErr w:type="gramEnd"/>
+    </w:p>
+    <w:p>
+      <w:pPr>
+        <w:pStyle w:val="ListParagraph"/>
+        <w:numPr>
+          <w:ilvl w:val="0"/>
+          <w:numId w:val="2"/>
+        </w:numPr>
+        <w:spacing w:after="60"/>
+      </w:pPr>
+      <w:r>
+        <w:t xml:space="preserve">Added Find in Files icon to the </w:t>
+      </w:r>
+      <w:proofErr w:type="gramStart"/>
+      <w:r>
+        <w:t>toolbar</w:t>
+      </w:r>
+      <w:proofErr w:type="gramEnd"/>
     </w:p>
     <w:p>
       <w:pPr>
@@ -1109,8 +1235,13 @@
         <w:spacing w:after="60"/>
       </w:pPr>
       <w:r>
-        <w:t>Binary/HEX files now have a dedicated editor and are no longer restricted to read-only viewing</w:t>
-      </w:r>
+        <w:t xml:space="preserve">Binary/HEX files now have a dedicated editor and are no longer restricted to read-only </w:t>
+      </w:r>
+      <w:proofErr w:type="gramStart"/>
+      <w:r>
+        <w:t>viewing</w:t>
+      </w:r>
+      <w:proofErr w:type="gramEnd"/>
     </w:p>
     <w:p>
       <w:pPr>
@@ -1147,8 +1278,13 @@
       </w:pPr>
       <w:r>
         <w:lastRenderedPageBreak/>
-        <w:t>Resolved an issue where text files containing many null characters (e.g., Compass log files) were incorrectly flagged as binary; file-type detection now correctly identifies them as text</w:t>
-      </w:r>
+        <w:t xml:space="preserve">Resolved an issue where text files containing many null characters (e.g., Compass log files) were incorrectly flagged as binary; file-type detection now correctly identifies them as </w:t>
+      </w:r>
+      <w:proofErr w:type="gramStart"/>
+      <w:r>
+        <w:t>text</w:t>
+      </w:r>
+      <w:proofErr w:type="gramEnd"/>
     </w:p>
     <w:p>
       <w:pPr>
@@ -1184,21 +1320,31 @@
         <w:spacing w:after="60"/>
       </w:pPr>
       <w:r>
-        <w:t>Resolved MIME-type file associations opening the application without the actual file</w:t>
-      </w:r>
-    </w:p>
-    <w:p>
-      <w:pPr>
-        <w:pStyle w:val="ListParagraph"/>
-        <w:numPr>
-          <w:ilvl w:val="0"/>
-          <w:numId w:val="2"/>
-        </w:numPr>
-        <w:spacing w:after="60"/>
-      </w:pPr>
-      <w:r>
-        <w:t>Added toolbar icon to toggle between HEX editor and normal editor modes</w:t>
-      </w:r>
+        <w:t xml:space="preserve">Resolved MIME-type file associations opening the application without the actual </w:t>
+      </w:r>
+      <w:proofErr w:type="gramStart"/>
+      <w:r>
+        <w:t>file</w:t>
+      </w:r>
+      <w:proofErr w:type="gramEnd"/>
+    </w:p>
+    <w:p>
+      <w:pPr>
+        <w:pStyle w:val="ListParagraph"/>
+        <w:numPr>
+          <w:ilvl w:val="0"/>
+          <w:numId w:val="2"/>
+        </w:numPr>
+        <w:spacing w:after="60"/>
+      </w:pPr>
+      <w:r>
+        <w:t xml:space="preserve">Added toolbar icon to toggle between HEX editor and normal editor </w:t>
+      </w:r>
+      <w:proofErr w:type="gramStart"/>
+      <w:r>
+        <w:t>modes</w:t>
+      </w:r>
+      <w:proofErr w:type="gramEnd"/>
     </w:p>
     <w:p>
       <w:pPr>
@@ -1234,21 +1380,31 @@
         <w:spacing w:after="60"/>
       </w:pPr>
       <w:r>
-        <w:t>Resolved Windows “Open With…” right-click issue where n+ was spawning itself again when opening a file</w:t>
-      </w:r>
-    </w:p>
-    <w:p>
-      <w:pPr>
-        <w:pStyle w:val="ListParagraph"/>
-        <w:numPr>
-          <w:ilvl w:val="0"/>
-          <w:numId w:val="2"/>
-        </w:numPr>
-        <w:spacing w:after="60"/>
-      </w:pPr>
-      <w:r>
-        <w:t>Added Tools menu option to add or remove the “Open with n+” entry from the Windows right-click menu</w:t>
-      </w:r>
+        <w:t xml:space="preserve">Resolved Windows “Open With…” right-click issue where n+ was spawning itself again when opening a </w:t>
+      </w:r>
+      <w:proofErr w:type="gramStart"/>
+      <w:r>
+        <w:t>file</w:t>
+      </w:r>
+      <w:proofErr w:type="gramEnd"/>
+    </w:p>
+    <w:p>
+      <w:pPr>
+        <w:pStyle w:val="ListParagraph"/>
+        <w:numPr>
+          <w:ilvl w:val="0"/>
+          <w:numId w:val="2"/>
+        </w:numPr>
+        <w:spacing w:after="60"/>
+      </w:pPr>
+      <w:r>
+        <w:t xml:space="preserve">Added Tools menu option to add or remove the “Open with n+” entry from the Windows right-click </w:t>
+      </w:r>
+      <w:proofErr w:type="gramStart"/>
+      <w:r>
+        <w:t>menu</w:t>
+      </w:r>
+      <w:proofErr w:type="gramEnd"/>
     </w:p>
     <w:p>
       <w:pPr>
@@ -1284,34 +1440,49 @@
         <w:spacing w:after="60"/>
       </w:pPr>
       <w:r>
-        <w:t>Corrected live file monitoring to tail updates in real time rather than reloading the entire file</w:t>
-      </w:r>
-    </w:p>
-    <w:p>
-      <w:pPr>
-        <w:pStyle w:val="ListParagraph"/>
-        <w:numPr>
-          <w:ilvl w:val="0"/>
-          <w:numId w:val="2"/>
-        </w:numPr>
-        <w:spacing w:after="60"/>
-      </w:pPr>
-      <w:r>
-        <w:t>Fixed the blocking “File has changed” dialog that previously paused the application until a response was received</w:t>
-      </w:r>
-    </w:p>
-    <w:p>
-      <w:pPr>
-        <w:pStyle w:val="ListParagraph"/>
-        <w:numPr>
-          <w:ilvl w:val="0"/>
-          <w:numId w:val="2"/>
-        </w:numPr>
-        <w:spacing w:after="60"/>
-      </w:pPr>
-      <w:r>
-        <w:t>Added the ability to start live monitoring directly from the “File has changed” prompt</w:t>
-      </w:r>
+        <w:t xml:space="preserve">Corrected live file monitoring to tail updates in real time rather than reloading the entire </w:t>
+      </w:r>
+      <w:proofErr w:type="gramStart"/>
+      <w:r>
+        <w:t>file</w:t>
+      </w:r>
+      <w:proofErr w:type="gramEnd"/>
+    </w:p>
+    <w:p>
+      <w:pPr>
+        <w:pStyle w:val="ListParagraph"/>
+        <w:numPr>
+          <w:ilvl w:val="0"/>
+          <w:numId w:val="2"/>
+        </w:numPr>
+        <w:spacing w:after="60"/>
+      </w:pPr>
+      <w:r>
+        <w:t xml:space="preserve">Fixed the blocking “File has changed” dialog that previously paused the application until a response was </w:t>
+      </w:r>
+      <w:proofErr w:type="gramStart"/>
+      <w:r>
+        <w:t>received</w:t>
+      </w:r>
+      <w:proofErr w:type="gramEnd"/>
+    </w:p>
+    <w:p>
+      <w:pPr>
+        <w:pStyle w:val="ListParagraph"/>
+        <w:numPr>
+          <w:ilvl w:val="0"/>
+          <w:numId w:val="2"/>
+        </w:numPr>
+        <w:spacing w:after="60"/>
+      </w:pPr>
+      <w:r>
+        <w:t xml:space="preserve">Added the ability to start live monitoring directly from the “File has changed” </w:t>
+      </w:r>
+      <w:proofErr w:type="gramStart"/>
+      <w:r>
+        <w:t>prompt</w:t>
+      </w:r>
+      <w:proofErr w:type="gramEnd"/>
     </w:p>
     <w:p>
       <w:pPr>
@@ -1340,8 +1511,19 @@
           <w:iCs/>
           <w:color w:val="000000"/>
         </w:rPr>
-        <w:t>Fixed annoyances and added update checking</w:t>
-      </w:r>
+        <w:t xml:space="preserve">Fixed annoyances and added update </w:t>
+      </w:r>
+      <w:proofErr w:type="gramStart"/>
+      <w:r>
+        <w:rPr>
+          <w:rFonts w:asciiTheme="minorHAnsi" w:eastAsia="Times New Roman" w:hAnsiTheme="minorHAnsi" w:cstheme="minorHAnsi"/>
+          <w:i/>
+          <w:iCs/>
+          <w:color w:val="000000"/>
+        </w:rPr>
+        <w:t>checking</w:t>
+      </w:r>
+      <w:proofErr w:type="gramEnd"/>
     </w:p>
     <w:p>
       <w:pPr>
@@ -1368,8 +1550,17 @@
           <w:rFonts w:asciiTheme="minorHAnsi" w:eastAsia="Times New Roman" w:hAnsiTheme="minorHAnsi" w:cstheme="minorHAnsi"/>
           <w:color w:val="000000"/>
         </w:rPr>
-        <w:t>Improved tab clarity: selected and inactive tabs are now easier to distinguish</w:t>
-      </w:r>
+        <w:t xml:space="preserve">Improved tab clarity: selected and inactive tabs are now easier to </w:t>
+      </w:r>
+      <w:proofErr w:type="gramStart"/>
+      <w:r>
+        <w:rPr>
+          <w:rFonts w:asciiTheme="minorHAnsi" w:eastAsia="Times New Roman" w:hAnsiTheme="minorHAnsi" w:cstheme="minorHAnsi"/>
+          <w:color w:val="000000"/>
+        </w:rPr>
+        <w:t>distinguish</w:t>
+      </w:r>
+      <w:proofErr w:type="gramEnd"/>
     </w:p>
     <w:p>
       <w:pPr>
@@ -1396,8 +1587,17 @@
           <w:color w:val="000000"/>
         </w:rPr>
         <w:noBreakHyphen/>
-        <w:t>click “Open with n+” now reliably brings the window to the foreground</w:t>
-      </w:r>
+        <w:t xml:space="preserve">click “Open with n+” now reliably brings the window to the </w:t>
+      </w:r>
+      <w:proofErr w:type="gramStart"/>
+      <w:r>
+        <w:rPr>
+          <w:rFonts w:asciiTheme="minorHAnsi" w:eastAsia="Times New Roman" w:hAnsiTheme="minorHAnsi" w:cstheme="minorHAnsi"/>
+          <w:color w:val="000000"/>
+        </w:rPr>
+        <w:t>foreground</w:t>
+      </w:r>
+      <w:proofErr w:type="gramEnd"/>
     </w:p>
     <w:p>
       <w:pPr>
@@ -1416,8 +1616,17 @@
           <w:rFonts w:asciiTheme="minorHAnsi" w:eastAsia="Times New Roman" w:hAnsiTheme="minorHAnsi" w:cstheme="minorHAnsi"/>
           <w:color w:val="000000"/>
         </w:rPr>
-        <w:t>Added automatic version update checks</w:t>
-      </w:r>
+        <w:t xml:space="preserve">Added automatic version update </w:t>
+      </w:r>
+      <w:proofErr w:type="gramStart"/>
+      <w:r>
+        <w:rPr>
+          <w:rFonts w:asciiTheme="minorHAnsi" w:eastAsia="Times New Roman" w:hAnsiTheme="minorHAnsi" w:cstheme="minorHAnsi"/>
+          <w:color w:val="000000"/>
+        </w:rPr>
+        <w:t>checks</w:t>
+      </w:r>
+      <w:proofErr w:type="gramEnd"/>
     </w:p>
     <w:p>
       <w:pPr>
@@ -1639,13 +1848,7 @@
         </w:pBdr>
       </w:pPr>
       <w:r>
-        <w:t xml:space="preserve">June </w:t>
-      </w:r>
-      <w:r>
-        <w:t>18</w:t>
-      </w:r>
-      <w:r>
-        <w:t>, 2026</w:t>
+        <w:t>June 18, 2026</w:t>
       </w:r>
     </w:p>
     <w:p>
@@ -1724,6 +1927,7 @@
         <w:t xml:space="preserve">; removed </w:t>
       </w:r>
       <w:proofErr w:type="spellStart"/>
+      <w:proofErr w:type="gramStart"/>
       <w:r>
         <w:rPr>
           <w:rFonts w:ascii="Aptos" w:eastAsia="Times New Roman" w:hAnsi="Aptos" w:cs="Times New Roman"/>
@@ -1732,6 +1936,7 @@
         <w:t>os.execute</w:t>
       </w:r>
       <w:proofErr w:type="spellEnd"/>
+      <w:proofErr w:type="gramEnd"/>
       <w:r>
         <w:rPr>
           <w:rFonts w:ascii="Aptos" w:eastAsia="Times New Roman" w:hAnsi="Aptos" w:cs="Times New Roman"/>
@@ -1910,12 +2115,95 @@
     </w:p>
     <w:p>
       <w:pPr>
+        <w:pStyle w:val="Heading2"/>
+        <w:pBdr>
+          <w:bottom w:val="single" w:sz="6" w:space="4" w:color="BFBFBF"/>
+        </w:pBdr>
+      </w:pPr>
+      <w:r>
+        <w:t>July 1, 2026</w:t>
+      </w:r>
+    </w:p>
+    <w:p>
+      <w:pPr>
         <w:spacing w:after="180"/>
         <w:rPr>
-          <w:rFonts w:ascii="Aptos" w:eastAsia="Times New Roman" w:hAnsi="Aptos" w:cs="Times New Roman"/>
-          <w:color w:val="000000"/>
-        </w:rPr>
-      </w:pPr>
+          <w:rFonts w:ascii="Aptos" w:eastAsia="Times New Roman" w:hAnsi="Aptos" w:cstheme="minorHAnsi"/>
+          <w:color w:val="000000"/>
+        </w:rPr>
+      </w:pPr>
+    </w:p>
+    <w:p>
+      <w:pPr>
+        <w:numPr>
+          <w:ilvl w:val="0"/>
+          <w:numId w:val="9"/>
+        </w:numPr>
+        <w:spacing w:after="60"/>
+        <w:rPr>
+          <w:rFonts w:ascii="Aptos" w:hAnsi="Aptos"/>
+        </w:rPr>
+      </w:pPr>
+      <w:r>
+        <w:rPr>
+          <w:rFonts w:ascii="Aptos" w:hAnsi="Aptos"/>
+        </w:rPr>
+        <w:t>New: Multi-line tabs option with a dedicated toolbar icon</w:t>
+      </w:r>
+    </w:p>
+    <w:p>
+      <w:pPr>
+        <w:numPr>
+          <w:ilvl w:val="0"/>
+          <w:numId w:val="9"/>
+        </w:numPr>
+        <w:spacing w:after="60"/>
+        <w:rPr>
+          <w:rFonts w:ascii="Aptos" w:hAnsi="Aptos"/>
+        </w:rPr>
+      </w:pPr>
+      <w:r>
+        <w:rPr>
+          <w:rFonts w:ascii="Aptos" w:hAnsi="Aptos"/>
+        </w:rPr>
+        <w:t>Enhanced: Find dialog now supports “Find All” across all open documents</w:t>
+      </w:r>
+    </w:p>
+    <w:p>
+      <w:pPr>
+        <w:numPr>
+          <w:ilvl w:val="0"/>
+          <w:numId w:val="9"/>
+        </w:numPr>
+        <w:spacing w:after="60"/>
+        <w:rPr>
+          <w:rFonts w:ascii="Aptos" w:hAnsi="Aptos"/>
+        </w:rPr>
+      </w:pPr>
+      <w:r>
+        <w:rPr>
+          <w:rFonts w:ascii="Aptos" w:hAnsi="Aptos"/>
+        </w:rPr>
+        <w:t>Improved: The last active tab now correctly receives focus on startup</w:t>
+      </w:r>
+    </w:p>
+    <w:p>
+      <w:pPr>
+        <w:numPr>
+          <w:ilvl w:val="0"/>
+          <w:numId w:val="9"/>
+        </w:numPr>
+        <w:spacing w:after="60"/>
+        <w:rPr>
+          <w:rFonts w:ascii="Aptos" w:hAnsi="Aptos"/>
+        </w:rPr>
+      </w:pPr>
+      <w:r>
+        <w:rPr>
+          <w:rFonts w:ascii="Aptos" w:hAnsi="Aptos"/>
+        </w:rPr>
+        <w:t>Optimized: Better performance and stability with large files</w:t>
+      </w:r>
     </w:p>
     <w:p>
       <w:pPr>
@@ -2848,6 +3136,155 @@
     </w:lvl>
   </w:abstractNum>
   <w:abstractNum w:abstractNumId="5" w15:restartNumberingAfterBreak="0">
+    <w:nsid w:val="54D5448B"/>
+    <w:multiLevelType w:val="multilevel"/>
+    <w:tmpl w:val="9CD627C2"/>
+    <w:lvl w:ilvl="0">
+      <w:start w:val="1"/>
+      <w:numFmt w:val="bullet"/>
+      <w:lvlText w:val=""/>
+      <w:lvlJc w:val="left"/>
+      <w:pPr>
+        <w:tabs>
+          <w:tab w:val="num" w:pos="720"/>
+        </w:tabs>
+        <w:ind w:left="720" w:hanging="360"/>
+      </w:pPr>
+      <w:rPr>
+        <w:rFonts w:ascii="Symbol" w:hAnsi="Symbol" w:hint="default"/>
+        <w:sz w:val="20"/>
+      </w:rPr>
+    </w:lvl>
+    <w:lvl w:ilvl="1" w:tentative="1">
+      <w:start w:val="1"/>
+      <w:numFmt w:val="bullet"/>
+      <w:lvlText w:val=""/>
+      <w:lvlJc w:val="left"/>
+      <w:pPr>
+        <w:tabs>
+          <w:tab w:val="num" w:pos="1440"/>
+        </w:tabs>
+        <w:ind w:left="1440" w:hanging="360"/>
+      </w:pPr>
+      <w:rPr>
+        <w:rFonts w:ascii="Symbol" w:hAnsi="Symbol" w:hint="default"/>
+        <w:sz w:val="20"/>
+      </w:rPr>
+    </w:lvl>
+    <w:lvl w:ilvl="2" w:tentative="1">
+      <w:start w:val="1"/>
+      <w:numFmt w:val="bullet"/>
+      <w:lvlText w:val=""/>
+      <w:lvlJc w:val="left"/>
+      <w:pPr>
+        <w:tabs>
+          <w:tab w:val="num" w:pos="2160"/>
+        </w:tabs>
+        <w:ind w:left="2160" w:hanging="360"/>
+      </w:pPr>
+      <w:rPr>
+        <w:rFonts w:ascii="Symbol" w:hAnsi="Symbol" w:hint="default"/>
+        <w:sz w:val="20"/>
+      </w:rPr>
+    </w:lvl>
+    <w:lvl w:ilvl="3" w:tentative="1">
+      <w:start w:val="1"/>
+      <w:numFmt w:val="bullet"/>
+      <w:lvlText w:val=""/>
+      <w:lvlJc w:val="left"/>
+      <w:pPr>
+        <w:tabs>
+          <w:tab w:val="num" w:pos="2880"/>
+        </w:tabs>
+        <w:ind w:left="2880" w:hanging="360"/>
+      </w:pPr>
+      <w:rPr>
+        <w:rFonts w:ascii="Symbol" w:hAnsi="Symbol" w:hint="default"/>
+        <w:sz w:val="20"/>
+      </w:rPr>
+    </w:lvl>
+    <w:lvl w:ilvl="4" w:tentative="1">
+      <w:start w:val="1"/>
+      <w:numFmt w:val="bullet"/>
+      <w:lvlText w:val=""/>
+      <w:lvlJc w:val="left"/>
+      <w:pPr>
+        <w:tabs>
+          <w:tab w:val="num" w:pos="3600"/>
+        </w:tabs>
+        <w:ind w:left="3600" w:hanging="360"/>
+      </w:pPr>
+      <w:rPr>
+        <w:rFonts w:ascii="Symbol" w:hAnsi="Symbol" w:hint="default"/>
+        <w:sz w:val="20"/>
+      </w:rPr>
+    </w:lvl>
+    <w:lvl w:ilvl="5" w:tentative="1">
+      <w:start w:val="1"/>
+      <w:numFmt w:val="bullet"/>
+      <w:lvlText w:val=""/>
+      <w:lvlJc w:val="left"/>
+      <w:pPr>
+        <w:tabs>
+          <w:tab w:val="num" w:pos="4320"/>
+        </w:tabs>
+        <w:ind w:left="4320" w:hanging="360"/>
+      </w:pPr>
+      <w:rPr>
+        <w:rFonts w:ascii="Symbol" w:hAnsi="Symbol" w:hint="default"/>
+        <w:sz w:val="20"/>
+      </w:rPr>
+    </w:lvl>
+    <w:lvl w:ilvl="6" w:tentative="1">
+      <w:start w:val="1"/>
+      <w:numFmt w:val="bullet"/>
+      <w:lvlText w:val=""/>
+      <w:lvlJc w:val="left"/>
+      <w:pPr>
+        <w:tabs>
+          <w:tab w:val="num" w:pos="5040"/>
+        </w:tabs>
+        <w:ind w:left="5040" w:hanging="360"/>
+      </w:pPr>
+      <w:rPr>
+        <w:rFonts w:ascii="Symbol" w:hAnsi="Symbol" w:hint="default"/>
+        <w:sz w:val="20"/>
+      </w:rPr>
+    </w:lvl>
+    <w:lvl w:ilvl="7" w:tentative="1">
+      <w:start w:val="1"/>
+      <w:numFmt w:val="bullet"/>
+      <w:lvlText w:val=""/>
+      <w:lvlJc w:val="left"/>
+      <w:pPr>
+        <w:tabs>
+          <w:tab w:val="num" w:pos="5760"/>
+        </w:tabs>
+        <w:ind w:left="5760" w:hanging="360"/>
+      </w:pPr>
+      <w:rPr>
+        <w:rFonts w:ascii="Symbol" w:hAnsi="Symbol" w:hint="default"/>
+        <w:sz w:val="20"/>
+      </w:rPr>
+    </w:lvl>
+    <w:lvl w:ilvl="8" w:tentative="1">
+      <w:start w:val="1"/>
+      <w:numFmt w:val="bullet"/>
+      <w:lvlText w:val=""/>
+      <w:lvlJc w:val="left"/>
+      <w:pPr>
+        <w:tabs>
+          <w:tab w:val="num" w:pos="6480"/>
+        </w:tabs>
+        <w:ind w:left="6480" w:hanging="360"/>
+      </w:pPr>
+      <w:rPr>
+        <w:rFonts w:ascii="Symbol" w:hAnsi="Symbol" w:hint="default"/>
+        <w:sz w:val="20"/>
+      </w:rPr>
+    </w:lvl>
+  </w:abstractNum>
+  <w:abstractNum w:abstractNumId="6" w15:restartNumberingAfterBreak="0">
     <w:nsid w:val="5AEC5DB4"/>
     <w:multiLevelType w:val="hybridMultilevel"/>
     <w:tmpl w:val="35D0BF50"/>
@@ -2933,7 +3370,7 @@
       </w:pPr>
     </w:lvl>
   </w:abstractNum>
-  <w:abstractNum w:abstractNumId="6" w15:restartNumberingAfterBreak="0">
+  <w:abstractNum w:abstractNumId="7" w15:restartNumberingAfterBreak="0">
     <w:nsid w:val="77925BEA"/>
     <w:multiLevelType w:val="hybridMultilevel"/>
     <w:tmpl w:val="CFC2EFAC"/>
@@ -2987,14 +3424,127 @@
       <w:lvlJc w:val="left"/>
     </w:lvl>
   </w:abstractNum>
+  <w:abstractNum w:abstractNumId="8" w15:restartNumberingAfterBreak="0">
+    <w:nsid w:val="7F025031"/>
+    <w:multiLevelType w:val="hybridMultilevel"/>
+    <w:tmpl w:val="5DC8536E"/>
+    <w:lvl w:ilvl="0" w:tplc="04090001">
+      <w:start w:val="1"/>
+      <w:numFmt w:val="bullet"/>
+      <w:lvlText w:val=""/>
+      <w:lvlJc w:val="left"/>
+      <w:pPr>
+        <w:ind w:left="1080" w:hanging="360"/>
+      </w:pPr>
+      <w:rPr>
+        <w:rFonts w:ascii="Symbol" w:hAnsi="Symbol" w:hint="default"/>
+      </w:rPr>
+    </w:lvl>
+    <w:lvl w:ilvl="1" w:tplc="04090003" w:tentative="1">
+      <w:start w:val="1"/>
+      <w:numFmt w:val="bullet"/>
+      <w:lvlText w:val="o"/>
+      <w:lvlJc w:val="left"/>
+      <w:pPr>
+        <w:ind w:left="1800" w:hanging="360"/>
+      </w:pPr>
+      <w:rPr>
+        <w:rFonts w:ascii="Courier New" w:hAnsi="Courier New" w:cs="Courier New" w:hint="default"/>
+      </w:rPr>
+    </w:lvl>
+    <w:lvl w:ilvl="2" w:tplc="04090005" w:tentative="1">
+      <w:start w:val="1"/>
+      <w:numFmt w:val="bullet"/>
+      <w:lvlText w:val=""/>
+      <w:lvlJc w:val="left"/>
+      <w:pPr>
+        <w:ind w:left="2520" w:hanging="360"/>
+      </w:pPr>
+      <w:rPr>
+        <w:rFonts w:ascii="Wingdings" w:hAnsi="Wingdings" w:hint="default"/>
+      </w:rPr>
+    </w:lvl>
+    <w:lvl w:ilvl="3" w:tplc="04090001" w:tentative="1">
+      <w:start w:val="1"/>
+      <w:numFmt w:val="bullet"/>
+      <w:lvlText w:val=""/>
+      <w:lvlJc w:val="left"/>
+      <w:pPr>
+        <w:ind w:left="3240" w:hanging="360"/>
+      </w:pPr>
+      <w:rPr>
+        <w:rFonts w:ascii="Symbol" w:hAnsi="Symbol" w:hint="default"/>
+      </w:rPr>
+    </w:lvl>
+    <w:lvl w:ilvl="4" w:tplc="04090003" w:tentative="1">
+      <w:start w:val="1"/>
+      <w:numFmt w:val="bullet"/>
+      <w:lvlText w:val="o"/>
+      <w:lvlJc w:val="left"/>
+      <w:pPr>
+        <w:ind w:left="3960" w:hanging="360"/>
+      </w:pPr>
+      <w:rPr>
+        <w:rFonts w:ascii="Courier New" w:hAnsi="Courier New" w:cs="Courier New" w:hint="default"/>
+      </w:rPr>
+    </w:lvl>
+    <w:lvl w:ilvl="5" w:tplc="04090005" w:tentative="1">
+      <w:start w:val="1"/>
+      <w:numFmt w:val="bullet"/>
+      <w:lvlText w:val=""/>
+      <w:lvlJc w:val="left"/>
+      <w:pPr>
+        <w:ind w:left="4680" w:hanging="360"/>
+      </w:pPr>
+      <w:rPr>
+        <w:rFonts w:ascii="Wingdings" w:hAnsi="Wingdings" w:hint="default"/>
+      </w:rPr>
+    </w:lvl>
+    <w:lvl w:ilvl="6" w:tplc="04090001" w:tentative="1">
+      <w:start w:val="1"/>
+      <w:numFmt w:val="bullet"/>
+      <w:lvlText w:val=""/>
+      <w:lvlJc w:val="left"/>
+      <w:pPr>
+        <w:ind w:left="5400" w:hanging="360"/>
+      </w:pPr>
+      <w:rPr>
+        <w:rFonts w:ascii="Symbol" w:hAnsi="Symbol" w:hint="default"/>
+      </w:rPr>
+    </w:lvl>
+    <w:lvl w:ilvl="7" w:tplc="04090003" w:tentative="1">
+      <w:start w:val="1"/>
+      <w:numFmt w:val="bullet"/>
+      <w:lvlText w:val="o"/>
+      <w:lvlJc w:val="left"/>
+      <w:pPr>
+        <w:ind w:left="6120" w:hanging="360"/>
+      </w:pPr>
+      <w:rPr>
+        <w:rFonts w:ascii="Courier New" w:hAnsi="Courier New" w:cs="Courier New" w:hint="default"/>
+      </w:rPr>
+    </w:lvl>
+    <w:lvl w:ilvl="8" w:tplc="04090005" w:tentative="1">
+      <w:start w:val="1"/>
+      <w:numFmt w:val="bullet"/>
+      <w:lvlText w:val=""/>
+      <w:lvlJc w:val="left"/>
+      <w:pPr>
+        <w:ind w:left="6840" w:hanging="360"/>
+      </w:pPr>
+      <w:rPr>
+        <w:rFonts w:ascii="Wingdings" w:hAnsi="Wingdings" w:hint="default"/>
+      </w:rPr>
+    </w:lvl>
+  </w:abstractNum>
   <w:num w:numId="1" w16cid:durableId="1802846629">
-    <w:abstractNumId w:val="5"/>
+    <w:abstractNumId w:val="6"/>
     <w:lvlOverride w:ilvl="0">
       <w:startOverride w:val="1"/>
     </w:lvlOverride>
   </w:num>
   <w:num w:numId="2" w16cid:durableId="1815637663">
-    <w:abstractNumId w:val="6"/>
+    <w:abstractNumId w:val="7"/>
     <w:lvlOverride w:ilvl="0">
       <w:startOverride w:val="1"/>
     </w:lvlOverride>
@@ -3013,6 +3563,12 @@
   </w:num>
   <w:num w:numId="7" w16cid:durableId="1702120839">
     <w:abstractNumId w:val="3"/>
+  </w:num>
+  <w:num w:numId="8" w16cid:durableId="679311819">
+    <w:abstractNumId w:val="5"/>
+  </w:num>
+  <w:num w:numId="9" w16cid:durableId="1001276019">
+    <w:abstractNumId w:val="8"/>
   </w:num>
 </w:numbering>
 </file>
@@ -3505,7 +4061,6 @@
   <w:style w:type="character" w:default="1" w:styleId="DefaultParagraphFont">
     <w:name w:val="Default Paragraph Font"/>
     <w:uiPriority w:val="1"/>
-    <w:semiHidden/>
     <w:unhideWhenUsed/>
   </w:style>
   <w:style w:type="table" w:default="1" w:styleId="TableNormal">

</xml_diff>